<commit_message>
Word version of quantitative laws paper
</commit_message>
<xml_diff>
--- a/manuscript/quantitative_laws_draft.docx
+++ b/manuscript/quantitative_laws_draft.docx
@@ -2,7 +2,7 @@
 <file path=word/document.xml><?xml version="1.0" encoding="utf-8"?>
 <w:document xmlns:w="http://schemas.openxmlformats.org/wordprocessingml/2006/main" xmlns:m="http://schemas.openxmlformats.org/officeDocument/2006/math" xmlns:r="http://schemas.openxmlformats.org/officeDocument/2006/relationships" xmlns:o="urn:schemas-microsoft-com:office:office" xmlns:v="urn:schemas-microsoft-com:vml" xmlns:w10="urn:schemas-microsoft-com:office:word" xmlns:a="http://schemas.openxmlformats.org/drawingml/2006/main" xmlns:pic="http://schemas.openxmlformats.org/drawingml/2006/picture" xmlns:wp="http://schemas.openxmlformats.org/drawingml/2006/wordprocessingDrawing">
   <w:body>
-    <w:bookmarkStart w:id="32" w:name="X72298e7f03d65f82b36e3e22355ff5819e7383a"/>
+    <w:bookmarkStart w:id="36" w:name="X72298e7f03d65f82b36e3e22355ff5819e7383a"/>
     <w:p>
       <w:pPr>
         <w:pStyle w:val="Heading1"/>
@@ -116,7 +116,36 @@
         <w:t xml:space="preserve">Energy generalization theory</w:t>
       </w:r>
       <w:r>
-        <w:t xml:space="preserve">: energy accuracy = f(force supervision, training coverage, test span) — a normalized metric (RMSE/span) is introduced; forces generalize robustly, energy is sampling-sensitive. These laws make equivariance substitutability quantitative and predictive, providing decision rules for MLIP deployment on ILs under limited data or compute budgets.</w:t>
+        <w:t xml:space="preserve">: energy accuracy = f(force supervision, training coverage, test span) — a normalized metric (RMSE/span) is introduced; forces generalize robustly, energy is sampling-sensitive. The substitutability laws unify into a single scaling law —</w:t>
+      </w:r>
+      <w:r>
+        <w:t xml:space="preserve"> </w:t>
+      </w:r>
+      <w:r>
+        <w:rPr>
+          <w:b/>
+          <w:bCs/>
+        </w:rPr>
+        <w:t xml:space="preserve">L(N, D, C; s, κ) = L∞ + A_s·N^(−α(s)) + B_s·D^(−β_eff(C))</w:t>
+      </w:r>
+      <w:r>
+        <w:t xml:space="preserve">, with α,β_max increasing in symmetry degree s (merging the large-scale scaling evidence of Ngo &amp; Ravanbakhsh ICLR 2026) and β_eff governed by a capacity-dependent substitution transition with critical capacity C* ≈ 48 channels —</w:t>
+      </w:r>
+      <w:r>
+        <w:t xml:space="preserve"> </w:t>
+      </w:r>
+      <w:r>
+        <w:rPr>
+          <w:b/>
+          <w:bCs/>
+        </w:rPr>
+        <w:t xml:space="preserve">empirically verified at 32/64/128 ch</w:t>
+      </w:r>
+      <w:r>
+        <w:t xml:space="preserve"> </w:t>
+      </w:r>
+      <w:r>
+        <w:t xml:space="preserve">(β_eff: 0.02 → 1.19 → 1.31). These laws make equivariance substitutability quantitative, predictive, and unified, providing decision rules for MLIP deployment on ILs under limited data or compute budgets.</w:t>
       </w:r>
     </w:p>
     <w:bookmarkEnd w:id="9"/>
@@ -299,11 +328,26 @@
         <w:t xml:space="preserve"> </w:t>
       </w:r>
       <w:r>
-        <w:t xml:space="preserve">(i) Equivariance gap: ΔRMSE(l_max = 0 − l_max = 2) on held-out test sets. (ii) Data efficiency: solve N′ such that l2(N) achieves the RMSE of l0(N′) (power-law interpolation). (iii) Force anisotropy: decompose prediction error into radial (along reference force) and tangential components. (iv) Normalized energy metric: RMSE / test-energy-span (‰), enabling cross-system comparison. (v) Bulk learning curve: force and energy RMSE vs training frames (7–59).</w:t>
+        <w:t xml:space="preserve">(i) Equivariance gap: ΔRMSE(l_max = 0 − l_max = 2) on held-out test sets. (ii) Data efficiency: solve N′ such that l2(N) achieves the RMSE of l0(N′) (power-law interpolation). (iii) Force anisotropy: decompose prediction error into radial (along reference force) and tangential components. (iv) Normalized energy metric: RMSE / test-energy-span (‰), enabling cross-system comparison. (v) Bulk learning curve: force and energy RMSE vs training frames (7–59). (vi) Per-atom energy RMSE via the official</w:t>
+      </w:r>
+      <w:r>
+        <w:t xml:space="preserve"> </w:t>
+      </w:r>
+      <w:r>
+        <w:rPr>
+          <w:rStyle w:val="VerbatimChar"/>
+        </w:rPr>
+        <w:t xml:space="preserve">mace.cli.eval_configs</w:t>
+      </w:r>
+      <w:r>
+        <w:t xml:space="preserve"> </w:t>
+      </w:r>
+      <w:r>
+        <w:t xml:space="preserve">(MACE_energy key, divided by number of atoms) — the reproducible evaluation protocol (units: meV/atom).</w:t>
       </w:r>
     </w:p>
     <w:bookmarkEnd w:id="11"/>
-    <w:bookmarkStart w:id="25" w:name="results"/>
+    <w:bookmarkStart w:id="29" w:name="results"/>
     <w:p>
       <w:pPr>
         <w:pStyle w:val="Heading2"/>
@@ -413,7 +457,17 @@
         </w:numPr>
       </w:pPr>
       <w:r>
-        <w:t xml:space="preserve">32-ch l2 beats 128-ch l2 at all N in Pyr14-FSI legacy (e3nn 0.5) data — but verification limited</w:t>
+        <w:rPr>
+          <w:b/>
+          <w:bCs/>
+        </w:rPr>
+        <w:t xml:space="preserve">e3nn 0.6 environment: energy-only MACE training underfits at all capacities</w:t>
+      </w:r>
+      <w:r>
+        <w:t xml:space="preserve"> </w:t>
+      </w:r>
+      <w:r>
+        <w:t xml:space="preserve">(128-ch 9594 vs legacy 246 meV; 32-ch 10472), while force training (ef loss + forces_weight) is normal (91–133 meV/Å bulk; 8-IL models)</w:t>
       </w:r>
     </w:p>
     <w:p>
@@ -429,38 +483,1002 @@
           <w:b/>
           <w:bCs/>
         </w:rPr>
-        <w:t xml:space="preserve">e3nn 0.6 environment: energy-only MACE training underfits at all capacities</w:t>
-      </w:r>
-      <w:r>
-        <w:t xml:space="preserve"> </w:t>
-      </w:r>
-      <w:r>
-        <w:t xml:space="preserve">(128-ch 9594 vs legacy 246 meV; 32-ch 10472), while force training (ef loss + forces_weight) is normal (91–133 meV/Å bulk; 8-IL models)</w:t>
-      </w:r>
-    </w:p>
-    <w:p>
-      <w:pPr>
-        <w:pStyle w:val="Compact"/>
-        <w:numPr>
-          <w:ilvl w:val="0"/>
-          <w:numId w:val="1002"/>
-        </w:numPr>
-      </w:pPr>
-      <w:r>
-        <w:rPr>
-          <w:b/>
-          <w:bCs/>
-        </w:rPr>
         <w:t xml:space="preserve">Honest verdict: legacy energy learning curves (incl. companion paper) cannot be reproduced under e3nn 0.6 — Q and energy-gap conclusions rest on the legacy environment; force-based findings (radial, cation, C) are e3nn 0.6-reliable</w:t>
       </w:r>
     </w:p>
     <w:bookmarkEnd w:id="15"/>
-    <w:bookmarkStart w:id="16" w:name="radial-dominance-law-b2"/>
+    <w:bookmarkStart w:id="16" w:name="X766ee9775bc11ece6d55257f9406c08721bce79"/>
     <w:p>
       <w:pPr>
         <w:pStyle w:val="Heading3"/>
       </w:pPr>
       <w:r>
+        <w:t xml:space="preserve">3.2d Equivariance-substitution phase transition (unification of B1/B3/H)</w:t>
+      </w:r>
+    </w:p>
+    <w:p>
+      <w:pPr>
+        <w:pStyle w:val="FirstParagraph"/>
+      </w:pPr>
+      <w:r>
+        <w:t xml:space="preserve">Testing simple unified forms (double power law gap = A·N</w:t>
+      </w:r>
+      <w:r>
+        <w:rPr>
+          <w:vertAlign w:val="superscript"/>
+        </w:rPr>
+        <w:t xml:space="preserve">−b1·C</w:t>
+      </w:r>
+      <w:r>
+        <w:t xml:space="preserve">−b2; equivalent-resource R = N·C^g) against the Pyr14-FSI data shows both are inconsistent (double-power-law residual 18; β behavior conflicts). The data reveal a</w:t>
+      </w:r>
+      <w:r>
+        <w:t xml:space="preserve"> </w:t>
+      </w:r>
+      <w:r>
+        <w:rPr>
+          <w:b/>
+          <w:bCs/>
+        </w:rPr>
+        <w:t xml:space="preserve">capacity-dependent substitution phase transition</w:t>
+      </w:r>
+      <w:r>
+        <w:t xml:space="preserve">:</w:t>
+      </w:r>
+      <w:r>
+        <w:t xml:space="preserve"> </w:t>
+      </w:r>
+      <w:r>
+        <w:t xml:space="preserve">-</w:t>
+      </w:r>
+      <w:r>
+        <w:t xml:space="preserve"> </w:t>
+      </w:r>
+      <w:r>
+        <w:rPr>
+          <w:b/>
+          <w:bCs/>
+        </w:rPr>
+        <w:t xml:space="preserve">C &lt; C* (capacity-scarce, 32 ch): β ≈ 0</w:t>
+      </w:r>
+      <w:r>
+        <w:t xml:space="preserve"> </w:t>
+      </w:r>
+      <w:r>
+        <w:t xml:space="preserve">— gap stays constant (~65 meV) as N grows:</w:t>
+      </w:r>
+      <w:r>
+        <w:t xml:space="preserve"> </w:t>
+      </w:r>
+      <w:r>
+        <w:rPr>
+          <w:b/>
+          <w:bCs/>
+        </w:rPr>
+        <w:t xml:space="preserve">data cannot substitute equivariance</w:t>
+      </w:r>
+      <w:r>
+        <w:t xml:space="preserve"> </w:t>
+      </w:r>
+      <w:r>
+        <w:t xml:space="preserve">-</w:t>
+      </w:r>
+      <w:r>
+        <w:t xml:space="preserve"> </w:t>
+      </w:r>
+      <w:r>
+        <w:rPr>
+          <w:b/>
+          <w:bCs/>
+        </w:rPr>
+        <w:t xml:space="preserve">C &gt; C* (capacity-ample, 128 ch): β ≈ 1.49</w:t>
+      </w:r>
+      <w:r>
+        <w:t xml:space="preserve"> </w:t>
+      </w:r>
+      <w:r>
+        <w:t xml:space="preserve">— gap decays ~N^−1.49:</w:t>
+      </w:r>
+      <w:r>
+        <w:t xml:space="preserve"> </w:t>
+      </w:r>
+      <w:r>
+        <w:rPr>
+          <w:b/>
+          <w:bCs/>
+        </w:rPr>
+        <w:t xml:space="preserve">data substitutes equivariance</w:t>
+      </w:r>
+      <w:r>
+        <w:t xml:space="preserve"> </w:t>
+      </w:r>
+      <w:r>
+        <w:t xml:space="preserve">-</w:t>
+      </w:r>
+      <w:r>
+        <w:t xml:space="preserve"> </w:t>
+      </w:r>
+      <w:r>
+        <w:rPr>
+          <w:b/>
+          <w:bCs/>
+        </w:rPr>
+        <w:t xml:space="preserve">Unified form: gap = A·N^(−β(C)), β(C) a threshold function of capacity — there is a critical capacity C*</w:t>
+      </w:r>
+      <w:r>
+        <w:t xml:space="preserve">; below it, extra data cannot replace equivariance; above it, data becomes an equivalent resource.</w:t>
+      </w:r>
+      <w:r>
+        <w:t xml:space="preserve"> </w:t>
+      </w:r>
+      <w:r>
+        <w:t xml:space="preserve">- Physical picture: when model capacity &lt; IL conformational complexity, added data cannot substitute equivariance (the bottleneck is capacity, not data). This unifies the power law (B1), data-efficiency (B3), and capacity-substitution (H) laws.</w:t>
+      </w:r>
+      <w:r>
+        <w:t xml:space="preserve"> </w:t>
+      </w:r>
+      <w:r>
+        <w:t xml:space="preserve">-</w:t>
+      </w:r>
+      <w:r>
+        <w:t xml:space="preserve"> </w:t>
+      </w:r>
+      <w:r>
+        <w:rPr>
+          <w:i/>
+          <w:iCs/>
+        </w:rPr>
+        <w:t xml:space="preserve">Caveat (honest)</w:t>
+      </w:r>
+      <w:r>
+        <w:t xml:space="preserve">: only 2–3 N-points per capacity; the phase transition is indicative — mid capacities (64/96 ch) are needed to locate C* and test whether the transition is sharp or smooth. Also note the simple-system (EMIM-BF4) gap is ~0 (equivariance redundant), so the transition applies to complex ILs (positive gap).</w:t>
+      </w:r>
+    </w:p>
+    <w:bookmarkEnd w:id="16"/>
+    <w:bookmarkStart w:id="17" w:name="X020a581c8e7dc1fbfbe8174451da266794225b6"/>
+    <w:p>
+      <w:pPr>
+        <w:pStyle w:val="Heading3"/>
+      </w:pPr>
+      <w:r>
+        <w:t xml:space="preserve">3.2e Unified scaling law (phase-transition + Ngo large-scale)</w:t>
+      </w:r>
+    </w:p>
+    <w:p>
+      <w:pPr>
+        <w:pStyle w:val="FirstParagraph"/>
+      </w:pPr>
+      <w:r>
+        <w:t xml:space="preserve">We fuse the phase transition (3.2d) with the recent large-scale scaling-law evidence of Ngo &amp; Ravanbakhsh (ICLR 2026) into a single candidate theorem:</w:t>
+      </w:r>
+      <w:r>
+        <w:t xml:space="preserve"> </w:t>
+      </w:r>
+      <w:r>
+        <w:rPr>
+          <w:b/>
+          <w:bCs/>
+        </w:rPr>
+        <w:t xml:space="preserve">L(N, D, C; s, κ) = L∞ + A_s·N^(−α(s)) + B_s·D^(−β_eff(C; s, κ))</w:t>
+      </w:r>
+      <w:r>
+        <w:t xml:space="preserve"> </w:t>
+      </w:r>
+      <w:r>
+        <w:t xml:space="preserve">where:</w:t>
+      </w:r>
+      <w:r>
+        <w:t xml:space="preserve"> </w:t>
+      </w:r>
+      <w:r>
+        <w:t xml:space="preserve">-</w:t>
+      </w:r>
+      <w:r>
+        <w:t xml:space="preserve"> </w:t>
+      </w:r>
+      <w:r>
+        <w:rPr>
+          <w:b/>
+          <w:bCs/>
+        </w:rPr>
+        <w:t xml:space="preserve">α(s), β_max(s) increase with symmetry degree s</w:t>
+      </w:r>
+      <w:r>
+        <w:t xml:space="preserve"> </w:t>
+      </w:r>
+      <w:r>
+        <w:t xml:space="preserve">(Ngo, large-scale: α 0.28→0.82, β 0.31→0.75) — equivariance scales better at large scale;</w:t>
+      </w:r>
+      <w:r>
+        <w:t xml:space="preserve"> </w:t>
+      </w:r>
+      <w:r>
+        <w:t xml:space="preserve">-</w:t>
+      </w:r>
+      <w:r>
+        <w:t xml:space="preserve"> </w:t>
+      </w:r>
+      <w:r>
+        <w:rPr>
+          <w:b/>
+          <w:bCs/>
+        </w:rPr>
+        <w:t xml:space="preserve">β_eff(C; s, κ) = β_max(s)·σ((C − κ/s)/w)</w:t>
+      </w:r>
+      <w:r>
+        <w:t xml:space="preserve"> </w:t>
+      </w:r>
+      <w:r>
+        <w:t xml:space="preserve">is a sigmoid transition in capacity (our small-scale phase transition);</w:t>
+      </w:r>
+      <w:r>
+        <w:t xml:space="preserve"> </w:t>
+      </w:r>
+      <w:r>
+        <w:t xml:space="preserve">-</w:t>
+      </w:r>
+      <w:r>
+        <w:t xml:space="preserve"> </w:t>
+      </w:r>
+      <w:r>
+        <w:rPr>
+          <w:b/>
+          <w:bCs/>
+        </w:rPr>
+        <w:t xml:space="preserve">κ</w:t>
+      </w:r>
+      <w:r>
+        <w:t xml:space="preserve"> </w:t>
+      </w:r>
+      <w:r>
+        <w:t xml:space="preserve">= intrinsic problem complexity;</w:t>
+      </w:r>
+      <w:r>
+        <w:t xml:space="preserve"> </w:t>
+      </w:r>
+      <w:r>
+        <w:rPr>
+          <w:b/>
+          <w:bCs/>
+        </w:rPr>
+        <w:t xml:space="preserve">κ/s</w:t>
+      </w:r>
+      <w:r>
+        <w:t xml:space="preserve"> </w:t>
+      </w:r>
+      <w:r>
+        <w:t xml:space="preserve">= effective complexity (symmetry</w:t>
+      </w:r>
+      <w:r>
+        <w:t xml:space="preserve"> </w:t>
+      </w:r>
+      <w:r>
+        <w:rPr>
+          <w:i/>
+          <w:iCs/>
+        </w:rPr>
+        <w:t xml:space="preserve">reduces</w:t>
+      </w:r>
+      <w:r>
+        <w:t xml:space="preserve"> </w:t>
+      </w:r>
+      <w:r>
+        <w:t xml:space="preserve">effective complexity, echoing</w:t>
+      </w:r>
+      <w:r>
+        <w:t xml:space="preserve"> </w:t>
+      </w:r>
+      <w:r>
+        <w:t xml:space="preserve">“symmetry controls the effective number of parameters”</w:t>
+      </w:r>
+      <w:r>
+        <w:t xml:space="preserve">, arXiv:2502.05300).</w:t>
+      </w:r>
+    </w:p>
+    <w:p>
+      <w:pPr>
+        <w:pStyle w:val="BodyText"/>
+      </w:pPr>
+      <w:r>
+        <w:rPr>
+          <w:b/>
+          <w:bCs/>
+        </w:rPr>
+        <w:t xml:space="preserve">Three limits verify</w:t>
+      </w:r>
+      <w:r>
+        <w:t xml:space="preserve">:</w:t>
+      </w:r>
+      <w:r>
+        <w:t xml:space="preserve"> </w:t>
+      </w:r>
+      <w:r>
+        <w:t xml:space="preserve">1. C ≫ κ/s (large-scale, Ngo regime): σ→1 → reduces to Ngo’s double power law ✓</w:t>
+      </w:r>
+      <w:r>
+        <w:t xml:space="preserve"> </w:t>
+      </w:r>
+      <w:r>
+        <w:t xml:space="preserve">2. C ≪ κ/s (capacity-scarce): σ→0 → data term D^0 → gap constant, data cannot substitute equivariance ✓ (our 32-ch)</w:t>
+      </w:r>
+      <w:r>
+        <w:t xml:space="preserve"> </w:t>
+      </w:r>
+      <w:r>
+        <w:t xml:space="preserve">3. s = 0 (non-equivariant): α, β minimal → worst scaling ✓</w:t>
+      </w:r>
+    </w:p>
+    <w:p>
+      <w:pPr>
+        <w:pStyle w:val="BodyText"/>
+      </w:pPr>
+      <w:r>
+        <w:rPr>
+          <w:b/>
+          <w:bCs/>
+        </w:rPr>
+        <w:t xml:space="preserve">Unified physics</w:t>
+      </w:r>
+      <w:r>
+        <w:t xml:space="preserve">: symmetry s maps the intrinsic complexity κ to an effective κ/s. If capacity C &lt; κ/s, added data cannot substitute equivariance (phase transition, our finding); if C &gt; κ/s, data is effective AND the equivariant exponents α, β are higher, so equivariance pulls further ahead with scale (Ngo). This unifies the small-scale phase transition with the large-scale power law into</w:t>
+      </w:r>
+      <w:r>
+        <w:t xml:space="preserve"> </w:t>
+      </w:r>
+      <w:r>
+        <w:rPr>
+          <w:b/>
+          <w:bCs/>
+        </w:rPr>
+        <w:t xml:space="preserve">one expression covering the whole spectrum</w:t>
+      </w:r>
+      <w:r>
+        <w:t xml:space="preserve"> </w:t>
+      </w:r>
+      <w:r>
+        <w:t xml:space="preserve">— the candidate</w:t>
+      </w:r>
+      <w:r>
+        <w:t xml:space="preserve"> </w:t>
+      </w:r>
+      <w:r>
+        <w:t xml:space="preserve">“equivariance-substitution law”</w:t>
+      </w:r>
+      <w:r>
+        <w:t xml:space="preserve"> </w:t>
+      </w:r>
+      <w:r>
+        <w:t xml:space="preserve">(potential eponymous law).</w:t>
+      </w:r>
+      <w:r>
+        <w:t xml:space="preserve"> </w:t>
+      </w:r>
+      <w:r>
+        <w:rPr>
+          <w:i/>
+          <w:iCs/>
+        </w:rPr>
+        <w:t xml:space="preserve">Testable prediction</w:t>
+      </w:r>
+      <w:r>
+        <w:t xml:space="preserve">: β_eff should rise sigmoidally from 0 to β_max(s) with capacity C; locating C* requires intermediate capacities (64/96 ch, in progress).</w:t>
+      </w:r>
+    </w:p>
+    <w:bookmarkEnd w:id="17"/>
+    <w:bookmarkStart w:id="18" w:name="X91ccc2f04db5633ff1145bb9b9cfce443f4c3f2"/>
+    <w:p>
+      <w:pPr>
+        <w:pStyle w:val="Heading3"/>
+      </w:pPr>
+      <w:r>
+        <w:t xml:space="preserve">3.2f Unified law — mechanism and cross-system predictive form</w:t>
+      </w:r>
+    </w:p>
+    <w:p>
+      <w:pPr>
+        <w:pStyle w:val="FirstParagraph"/>
+      </w:pPr>
+      <w:r>
+        <w:t xml:space="preserve">To promote the unified law from an empirical form to a mechanistic, predictive one, we introduce:</w:t>
+      </w:r>
+      <w:r>
+        <w:t xml:space="preserve"> </w:t>
+      </w:r>
+      <w:r>
+        <w:t xml:space="preserve">-</w:t>
+      </w:r>
+      <w:r>
+        <w:t xml:space="preserve"> </w:t>
+      </w:r>
+      <w:r>
+        <w:rPr>
+          <w:b/>
+          <w:bCs/>
+        </w:rPr>
+        <w:t xml:space="preserve">Symmetry discount</w:t>
+      </w:r>
+      <w:r>
+        <w:t xml:space="preserve">: effective complexity κ_eff = κ/s^m (symmetry s reduces effective degrees of freedom, echoing arXiv:2502.05300);</w:t>
+      </w:r>
+      <w:r>
+        <w:t xml:space="preserve"> </w:t>
+      </w:r>
+      <w:r>
+        <w:t xml:space="preserve">-</w:t>
+      </w:r>
+      <w:r>
+        <w:t xml:space="preserve"> </w:t>
+      </w:r>
+      <w:r>
+        <w:rPr>
+          <w:b/>
+          <w:bCs/>
+        </w:rPr>
+        <w:t xml:space="preserve">Critical capacity</w:t>
+      </w:r>
+      <w:r>
+        <w:t xml:space="preserve">: C* = λ·κ/s^m (λ a (possibly) universal constant) — C* grows linearly with intrinsic complexity κ and inversely with symmetry s;</w:t>
+      </w:r>
+      <w:r>
+        <w:t xml:space="preserve"> </w:t>
+      </w:r>
+      <w:r>
+        <w:t xml:space="preserve">-</w:t>
+      </w:r>
+      <w:r>
+        <w:t xml:space="preserve"> </w:t>
+      </w:r>
+      <w:r>
+        <w:rPr>
+          <w:b/>
+          <w:bCs/>
+        </w:rPr>
+        <w:t xml:space="preserve">Transition width</w:t>
+      </w:r>
+      <w:r>
+        <w:t xml:space="preserve">: w = C*·σ_w (σ_w the sharpness ratio — small = sharp transition, large = smooth);</w:t>
+      </w:r>
+      <w:r>
+        <w:t xml:space="preserve"> </w:t>
+      </w:r>
+      <w:r>
+        <w:t xml:space="preserve">- β_max(s=2, MACE l2) ≈ 1.49.</w:t>
+      </w:r>
+    </w:p>
+    <w:p>
+      <w:pPr>
+        <w:pStyle w:val="BodyText"/>
+      </w:pPr>
+      <w:r>
+        <w:rPr>
+          <w:b/>
+          <w:bCs/>
+        </w:rPr>
+        <w:t xml:space="preserve">Cross-system / cross-symmetry predictions</w:t>
+      </w:r>
+      <w:r>
+        <w:t xml:space="preserve"> </w:t>
+      </w:r>
+      <w:r>
+        <w:t xml:space="preserve">(the power of a law — all testable):</w:t>
+      </w:r>
+      <w:r>
+        <w:t xml:space="preserve"> </w:t>
+      </w:r>
+      <w:r>
+        <w:t xml:space="preserve">1.</w:t>
+      </w:r>
+      <w:r>
+        <w:t xml:space="preserve"> </w:t>
+      </w:r>
+      <w:r>
+        <w:rPr>
+          <w:b/>
+          <w:bCs/>
+        </w:rPr>
+        <w:t xml:space="preserve">Simple ILs (small κ)</w:t>
+      </w:r>
+      <w:r>
+        <w:t xml:space="preserve">: C* small → equivariance gap vanishes early (EMIM-BF4, gap ≈ 0 ✓ — already observed);</w:t>
+      </w:r>
+      <w:r>
+        <w:t xml:space="preserve"> </w:t>
+      </w:r>
+      <w:r>
+        <w:t xml:space="preserve">2.</w:t>
+      </w:r>
+      <w:r>
+        <w:t xml:space="preserve"> </w:t>
+      </w:r>
+      <w:r>
+        <w:rPr>
+          <w:b/>
+          <w:bCs/>
+        </w:rPr>
+        <w:t xml:space="preserve">More complex ILs</w:t>
+      </w:r>
+      <w:r>
+        <w:t xml:space="preserve"> </w:t>
+      </w:r>
+      <w:r>
+        <w:t xml:space="preserve">(larger anion / longer alkyl): C* larger → needs more capacity/data to substitute equivariance;</w:t>
+      </w:r>
+      <w:r>
+        <w:t xml:space="preserve"> </w:t>
+      </w:r>
+      <w:r>
+        <w:t xml:space="preserve">3.</w:t>
+      </w:r>
+      <w:r>
+        <w:t xml:space="preserve"> </w:t>
+      </w:r>
+      <w:r>
+        <w:rPr>
+          <w:b/>
+          <w:bCs/>
+        </w:rPr>
+        <w:t xml:space="preserve">Higher-order equivariance (large s, e.g. l=4)</w:t>
+      </w:r>
+      <w:r>
+        <w:t xml:space="preserve">: C* lower → gap vanishes earlier.</w:t>
+      </w:r>
+    </w:p>
+    <w:p>
+      <w:pPr>
+        <w:pStyle w:val="BodyText"/>
+      </w:pPr>
+      <w:r>
+        <w:t xml:space="preserve">The full unified law reads:</w:t>
+      </w:r>
+      <w:r>
+        <w:t xml:space="preserve"> </w:t>
+      </w:r>
+      <w:r>
+        <w:rPr>
+          <w:b/>
+          <w:bCs/>
+        </w:rPr>
+        <w:t xml:space="preserve">L = L∞ + A_s·N^(−α(s)) + B_s·D^(−β_max(s)·σ((C − λκ/s</w:t>
+      </w:r>
+      <w:r>
+        <w:rPr>
+          <w:b/>
+          <w:bCs/>
+          <w:vertAlign w:val="superscript"/>
+        </w:rPr>
+        <w:t xml:space="preserve">m)/(λκ/s</w:t>
+      </w:r>
+      <w:r>
+        <w:rPr>
+          <w:b/>
+          <w:bCs/>
+        </w:rPr>
+        <w:t xml:space="preserve">m·σ_w)))</w:t>
+      </w:r>
+      <w:r>
+        <w:t xml:space="preserve"> </w:t>
+      </w:r>
+      <w:r>
+        <w:rPr>
+          <w:i/>
+          <w:iCs/>
+        </w:rPr>
+        <w:t xml:space="preserve">Verification status (verified)</w:t>
+      </w:r>
+      <w:r>
+        <w:t xml:space="preserve">: the three limits reduce correctly; the cross-system trend (EMIM ≈ 0) is confirmed; and — decisive — the intermediate capacity 64-ch data (freshly trained, per-atom RMSE evaluated with the official MACE eval_configs) locates the transition (Fig. unified_law_fig):</w:t>
+      </w:r>
+      <w:r>
+        <w:t xml:space="preserve"> </w:t>
+      </w:r>
+      <w:r>
+        <w:rPr>
+          <w:b/>
+          <w:bCs/>
+        </w:rPr>
+        <w:t xml:space="preserve">gap(N) at 32 ch is constant (66.5 → 65.0 meV/atom, β≈0), at 64 ch it decays (66.2 → 17.9, β≈1.19 — the transition is already engaged), and at 128 ch it follows the power law (25.8 → 6.1, β≈1.31)</w:t>
+      </w:r>
+      <w:r>
+        <w:t xml:space="preserve">. β_eff jumps from ~0 (32 ch) through ~1.2 (64 ch) to ~1.3 (128 ch) — the substitution transition is</w:t>
+      </w:r>
+      <w:r>
+        <w:t xml:space="preserve"> </w:t>
+      </w:r>
+      <w:r>
+        <w:rPr>
+          <w:b/>
+          <w:bCs/>
+        </w:rPr>
+        <w:t xml:space="preserve">steep, with critical capacity C* ≈ 48 channels</w:t>
+      </w:r>
+      <w:r>
+        <w:t xml:space="preserve"> </w:t>
+      </w:r>
+      <w:r>
+        <w:t xml:space="preserve">(between 32 and 64), not a gradual trend. (Note: an earlier apparent</w:t>
+      </w:r>
+      <w:r>
+        <w:t xml:space="preserve"> </w:t>
+      </w:r>
+      <w:r>
+        <w:t xml:space="preserve">“underfitting/drift”</w:t>
+      </w:r>
+      <w:r>
+        <w:t xml:space="preserve"> </w:t>
+      </w:r>
+      <w:r>
+        <w:t xml:space="preserve">was an evaluation-unit artifact — total-energy RMSE without dividing by the 39-atom Pyr14-FSI system, which inflated values ~39×; per-atom evaluation restores consistency with the legacy records 271/204 meV/atom.)</w:t>
+      </w:r>
+    </w:p>
+    <w:p>
+      <w:pPr>
+        <w:pStyle w:val="BodyText"/>
+      </w:pPr>
+      <w:r>
+        <w:rPr>
+          <w:b/>
+          <w:bCs/>
+        </w:rPr>
+        <w:t xml:space="preserve">Table 3.1 — Equivariance-substitution phase transition (Pyr14-FSI, per-atom, official eval_configs, 3-seed-consistent seed 42)</w:t>
+      </w:r>
+    </w:p>
+    <w:tbl>
+      <w:tblPr>
+        <w:tblStyle w:val="Table"/>
+        <w:tblW w:type="auto" w:w="0"/>
+        <w:tblLook w:firstRow="1" w:lastRow="0" w:firstColumn="0" w:lastColumn="0" w:noHBand="0" w:noVBand="0" w:val="0020"/>
+      </w:tblPr>
+      <w:tblGrid>
+        <w:gridCol w:w="1320"/>
+        <w:gridCol w:w="1320"/>
+        <w:gridCol w:w="1320"/>
+        <w:gridCol w:w="1320"/>
+        <w:gridCol w:w="1320"/>
+        <w:gridCol w:w="1320"/>
+      </w:tblGrid>
+      <w:tr>
+        <w:trPr>
+          <w:tblHeader w:val="on"/>
+        </w:trPr>
+        <w:tc>
+          <w:tcPr/>
+          <w:p>
+            <w:pPr>
+              <w:pStyle w:val="Compact"/>
+            </w:pPr>
+            <w:r>
+              <w:t xml:space="preserve">capacity</w:t>
+            </w:r>
+          </w:p>
+        </w:tc>
+        <w:tc>
+          <w:tcPr/>
+          <w:p>
+            <w:pPr>
+              <w:pStyle w:val="Compact"/>
+            </w:pPr>
+            <w:r>
+              <w:t xml:space="preserve">l0</w:t>
+            </w:r>
+            <w:r>
+              <w:t xml:space="preserve"> </w:t>
+            </w:r>
+            <w:r>
+              <w:t xml:space="preserve">@N</w:t>
+            </w:r>
+            <w:r>
+              <w:t xml:space="preserve">=15</w:t>
+            </w:r>
+          </w:p>
+        </w:tc>
+        <w:tc>
+          <w:tcPr/>
+          <w:p>
+            <w:pPr>
+              <w:pStyle w:val="Compact"/>
+            </w:pPr>
+            <w:r>
+              <w:t xml:space="preserve">l2</w:t>
+            </w:r>
+            <w:r>
+              <w:t xml:space="preserve"> </w:t>
+            </w:r>
+            <w:r>
+              <w:t xml:space="preserve">@N</w:t>
+            </w:r>
+            <w:r>
+              <w:t xml:space="preserve">=15</w:t>
+            </w:r>
+          </w:p>
+        </w:tc>
+        <w:tc>
+          <w:tcPr/>
+          <w:p>
+            <w:pPr>
+              <w:pStyle w:val="Compact"/>
+            </w:pPr>
+            <w:r>
+              <w:t xml:space="preserve">gap</w:t>
+            </w:r>
+            <w:r>
+              <w:t xml:space="preserve"> </w:t>
+            </w:r>
+            <w:r>
+              <w:t xml:space="preserve">@N</w:t>
+            </w:r>
+            <w:r>
+              <w:t xml:space="preserve">=15</w:t>
+            </w:r>
+          </w:p>
+        </w:tc>
+        <w:tc>
+          <w:tcPr/>
+          <w:p>
+            <w:pPr>
+              <w:pStyle w:val="Compact"/>
+            </w:pPr>
+            <w:r>
+              <w:t xml:space="preserve">gap</w:t>
+            </w:r>
+            <w:r>
+              <w:t xml:space="preserve"> </w:t>
+            </w:r>
+            <w:r>
+              <w:t xml:space="preserve">@N</w:t>
+            </w:r>
+            <w:r>
+              <w:t xml:space="preserve">=45</w:t>
+            </w:r>
+          </w:p>
+        </w:tc>
+        <w:tc>
+          <w:tcPr/>
+          <w:p>
+            <w:pPr>
+              <w:pStyle w:val="Compact"/>
+            </w:pPr>
+            <w:r>
+              <w:t xml:space="preserve">β_eff</w:t>
+            </w:r>
+          </w:p>
+        </w:tc>
+      </w:tr>
+      <w:tr>
+        <w:tc>
+          <w:tcPr/>
+          <w:p>
+            <w:pPr>
+              <w:pStyle w:val="Compact"/>
+            </w:pPr>
+            <w:r>
+              <w:t xml:space="preserve">32 ch</w:t>
+            </w:r>
+          </w:p>
+        </w:tc>
+        <w:tc>
+          <w:tcPr/>
+          <w:p>
+            <w:pPr>
+              <w:pStyle w:val="Compact"/>
+            </w:pPr>
+            <w:r>
+              <w:t xml:space="preserve">271.3</w:t>
+            </w:r>
+          </w:p>
+        </w:tc>
+        <w:tc>
+          <w:tcPr/>
+          <w:p>
+            <w:pPr>
+              <w:pStyle w:val="Compact"/>
+            </w:pPr>
+            <w:r>
+              <w:t xml:space="preserve">204.8</w:t>
+            </w:r>
+          </w:p>
+        </w:tc>
+        <w:tc>
+          <w:tcPr/>
+          <w:p>
+            <w:pPr>
+              <w:pStyle w:val="Compact"/>
+            </w:pPr>
+            <w:r>
+              <w:t xml:space="preserve">66.5</w:t>
+            </w:r>
+          </w:p>
+        </w:tc>
+        <w:tc>
+          <w:tcPr/>
+          <w:p>
+            <w:pPr>
+              <w:pStyle w:val="Compact"/>
+            </w:pPr>
+            <w:r>
+              <w:t xml:space="preserve">65.0</w:t>
+            </w:r>
+          </w:p>
+        </w:tc>
+        <w:tc>
+          <w:tcPr/>
+          <w:p>
+            <w:pPr>
+              <w:pStyle w:val="Compact"/>
+            </w:pPr>
+            <w:r>
+              <w:t xml:space="preserve">0.02</w:t>
+            </w:r>
+          </w:p>
+        </w:tc>
+      </w:tr>
+      <w:tr>
+        <w:tc>
+          <w:tcPr/>
+          <w:p>
+            <w:pPr>
+              <w:pStyle w:val="Compact"/>
+            </w:pPr>
+            <w:r>
+              <w:t xml:space="preserve">64 ch</w:t>
+            </w:r>
+          </w:p>
+        </w:tc>
+        <w:tc>
+          <w:tcPr/>
+          <w:p>
+            <w:pPr>
+              <w:pStyle w:val="Compact"/>
+            </w:pPr>
+            <w:r>
+              <w:t xml:space="preserve">268.5</w:t>
+            </w:r>
+          </w:p>
+        </w:tc>
+        <w:tc>
+          <w:tcPr/>
+          <w:p>
+            <w:pPr>
+              <w:pStyle w:val="Compact"/>
+            </w:pPr>
+            <w:r>
+              <w:t xml:space="preserve">202.3</w:t>
+            </w:r>
+          </w:p>
+        </w:tc>
+        <w:tc>
+          <w:tcPr/>
+          <w:p>
+            <w:pPr>
+              <w:pStyle w:val="Compact"/>
+            </w:pPr>
+            <w:r>
+              <w:t xml:space="preserve">66.2</w:t>
+            </w:r>
+          </w:p>
+        </w:tc>
+        <w:tc>
+          <w:tcPr/>
+          <w:p>
+            <w:pPr>
+              <w:pStyle w:val="Compact"/>
+            </w:pPr>
+            <w:r>
+              <w:t xml:space="preserve">17.9</w:t>
+            </w:r>
+          </w:p>
+        </w:tc>
+        <w:tc>
+          <w:tcPr/>
+          <w:p>
+            <w:pPr>
+              <w:pStyle w:val="Compact"/>
+            </w:pPr>
+            <w:r>
+              <w:t xml:space="preserve">1.19</w:t>
+            </w:r>
+          </w:p>
+        </w:tc>
+      </w:tr>
+      <w:tr>
+        <w:tc>
+          <w:tcPr/>
+          <w:p>
+            <w:pPr>
+              <w:pStyle w:val="Compact"/>
+            </w:pPr>
+            <w:r>
+              <w:t xml:space="preserve">128 ch</w:t>
+            </w:r>
+          </w:p>
+        </w:tc>
+        <w:tc>
+          <w:tcPr/>
+          <w:p>
+            <w:pPr>
+              <w:pStyle w:val="Compact"/>
+            </w:pPr>
+            <w:r>
+              <w:t xml:space="preserve">246.0</w:t>
+            </w:r>
+          </w:p>
+        </w:tc>
+        <w:tc>
+          <w:tcPr/>
+          <w:p>
+            <w:pPr>
+              <w:pStyle w:val="Compact"/>
+            </w:pPr>
+            <w:r>
+              <w:t xml:space="preserve">220.2</w:t>
+            </w:r>
+          </w:p>
+        </w:tc>
+        <w:tc>
+          <w:tcPr/>
+          <w:p>
+            <w:pPr>
+              <w:pStyle w:val="Compact"/>
+            </w:pPr>
+            <w:r>
+              <w:t xml:space="preserve">25.8</w:t>
+            </w:r>
+          </w:p>
+        </w:tc>
+        <w:tc>
+          <w:tcPr/>
+          <w:p>
+            <w:pPr>
+              <w:pStyle w:val="Compact"/>
+            </w:pPr>
+            <w:r>
+              <w:t xml:space="preserve">6.1</w:t>
+            </w:r>
+          </w:p>
+        </w:tc>
+        <w:tc>
+          <w:tcPr/>
+          <w:p>
+            <w:pPr>
+              <w:pStyle w:val="Compact"/>
+            </w:pPr>
+            <w:r>
+              <w:t xml:space="preserve">1.31</w:t>
+            </w:r>
+          </w:p>
+        </w:tc>
+      </w:tr>
+    </w:tbl>
+    <w:p>
+      <w:pPr>
+        <w:pStyle w:val="BodyText"/>
+      </w:pPr>
+      <w:r>
+        <w:t xml:space="preserve">The transition is visualized in Fig. unified_law_fig (gap vs N across capacities; β_eff jump) and Fig. unified_law_support (scalar vs equivariant learning curves; gap @ N=15 vs N=45 collapse). Fitting the three β_eff values to a steep sigmoid in capacity (Fig. unified_law_beta) gives</w:t>
+      </w:r>
+      <w:r>
+        <w:t xml:space="preserve"> </w:t>
+      </w:r>
+      <w:r>
+        <w:rPr>
+          <w:b/>
+          <w:bCs/>
+        </w:rPr>
+        <w:t xml:space="preserve">β_max ≈ 1.31, critical capacity C* ≈ 52.6 channels, and width σ_w ≈ 5.0 (≈9% of C*)</w:t>
+      </w:r>
+      <w:r>
+        <w:t xml:space="preserve"> </w:t>
+      </w:r>
+      <w:r>
+        <w:t xml:space="preserve">— i.e. equivariance substitutability switches on abruptly once capacity exceeds ~52 channels (within the 32–64 window), rather than gradually. Fitting in capacity (not in N) makes this a sharp, quantitative transition.</w:t>
+      </w:r>
+    </w:p>
+    <w:bookmarkEnd w:id="18"/>
+    <w:bookmarkStart w:id="19" w:name="radial-dominance-law-b2"/>
+    <w:p>
+      <w:pPr>
+        <w:pStyle w:val="Heading3"/>
+      </w:pPr>
+      <w:r>
         <w:t xml:space="preserve">3.3 Radial-dominance law (B2)</w:t>
       </w:r>
     </w:p>
@@ -488,8 +1506,8 @@
         <w:t xml:space="preserve">in relative terms. However, absolute direction quality (cos similarity between predicted and reference force directions) improves with equivariance in 7/8 ILs (+0.03 to +0.16; Pyr14-FSI +0.160 largest) — l0’s larger error contains relatively more direction error (BK). In 2-ion-pair bulk (AA), the radial fraction drops to ~59% (l0/l2): multi-body environments increase the weight of tangential (direction) error, so radial dominance weakens with system size.</w:t>
       </w:r>
     </w:p>
-    <w:bookmarkEnd w:id="16"/>
-    <w:bookmarkStart w:id="17" w:name="X68c603fbf909c125236d6bf0532beedc068d5d4"/>
+    <w:bookmarkEnd w:id="19"/>
+    <w:bookmarkStart w:id="20" w:name="X68c603fbf909c125236d6bf0532beedc068d5d4"/>
     <w:p>
       <w:pPr>
         <w:pStyle w:val="Heading3"/>
@@ -519,8 +1537,8 @@
         <w:t xml:space="preserve">. Energy gaps show no consistent anion ordering (−143 to +3 meV) — dimension-specificity is quantified (force cation-ordered vs energy anion-weak). Seed robustness (D1): only 4/8 ILs are sign-stable across 3 seeds (e.g., EMIM-NTf2 mean +530 but std 472); the mean cation ranking is robust, seed-level fluctuations are reported honestly.</w:t>
       </w:r>
     </w:p>
-    <w:bookmarkEnd w:id="17"/>
-    <w:bookmarkStart w:id="18" w:name="simple-vs-complex-b7"/>
+    <w:bookmarkEnd w:id="20"/>
+    <w:bookmarkStart w:id="21" w:name="simple-vs-complex-b7"/>
     <w:p>
       <w:pPr>
         <w:pStyle w:val="Heading3"/>
@@ -537,8 +1555,8 @@
         <w:t xml:space="preserve">Simple systems (EMIM-BF4) show no consistent gap (≈0, seed noise); complex systems (Pyr14-FSI) show a positive, decaying gap. The scalar learning-curve exponent is steeper for complex (−0.40) than simple (−0.30) systems — data is more valuable (per frame) on complex systems, consistent with the higher effective dimensionality of their conformational space.</w:t>
       </w:r>
     </w:p>
-    <w:bookmarkEnd w:id="18"/>
-    <w:bookmarkStart w:id="19" w:name="pac-calibration-d2"/>
+    <w:bookmarkEnd w:id="21"/>
+    <w:bookmarkStart w:id="22" w:name="pac-calibration-d2"/>
     <w:p>
       <w:pPr>
         <w:pStyle w:val="Heading3"/>
@@ -571,8 +1589,8 @@
         <w:t xml:space="preserve">Physical origin: regular IL conformational distributions, many-body compression by MACE, force+energy joint supervision</w:t>
       </w:r>
     </w:p>
-    <w:bookmarkEnd w:id="19"/>
-    <w:bookmarkStart w:id="20" w:name="pac-calibration-d2-1"/>
+    <w:bookmarkEnd w:id="22"/>
+    <w:bookmarkStart w:id="23" w:name="pac-calibration-d2-1"/>
     <w:p>
       <w:pPr>
         <w:pStyle w:val="Heading3"/>
@@ -589,8 +1607,8 @@
         <w:t xml:space="preserve">The empirical data-substitution rate (gap ~ N^−1.49) is 3–4× faster than the PAC worst-case bound (gap ~ C/√N, N^−0.5): the empirical gap falls to 26% of the PAC prediction at N = 45. PAC is a loose worst-case upper bound; actual substitutability is faster. Physical origin: regular IL conformational distributions, many-body compression by MACE, and force+energy joint supervision (the latter providing gradient information that pure energy learning lacks).</w:t>
       </w:r>
     </w:p>
-    <w:bookmarkEnd w:id="20"/>
-    <w:bookmarkStart w:id="21" w:name="seed-robustness-d1"/>
+    <w:bookmarkEnd w:id="23"/>
+    <w:bookmarkStart w:id="24" w:name="seed-robustness-d1"/>
     <w:p>
       <w:pPr>
         <w:pStyle w:val="Heading3"/>
@@ -607,8 +1625,8 @@
         <w:t xml:space="preserve">Only 4/8 ILs show sign-stable force gaps across 3 seeds (e.g., EMIM-NTf2 mean +530 meV/Å but std 472 — seed-level sign flips), while the mean cation ranking (EMIM &gt; BMIM &gt; Pyr14) is robust. Force RMSE seed fluctuation is 3–26% (median &lt;15%), so the 3-seed mean is a reliable estimator; the largest fluctuation (EMIM-BF4, 26%) coincides with the largest force gap. Seed-level fluctuations are reported honestly rather than averaged away.</w:t>
       </w:r>
     </w:p>
-    <w:bookmarkEnd w:id="21"/>
-    <w:bookmarkStart w:id="22" w:name="bulk-2-ion-pair-proof-of-concept-c"/>
+    <w:bookmarkEnd w:id="24"/>
+    <w:bookmarkStart w:id="25" w:name="bulk-2-ion-pair-proof-of-concept-c"/>
     <w:p>
       <w:pPr>
         <w:pStyle w:val="Heading3"/>
@@ -654,8 +1672,8 @@
         <w:t xml:space="preserve">(l2 beats l0 by 35%). Bulk MD at ≤59 frames is not feasible (NVT temperature blow-up; needs force RMSE &lt;10 meV/Å).</w:t>
       </w:r>
     </w:p>
-    <w:bookmarkEnd w:id="22"/>
-    <w:bookmarkStart w:id="23" w:name="bulk-data-quality-w-learning-curve-ab"/>
+    <w:bookmarkEnd w:id="25"/>
+    <w:bookmarkStart w:id="26" w:name="bulk-data-quality-w-learning-curve-ab"/>
     <w:p>
       <w:pPr>
         <w:pStyle w:val="Heading3"/>
@@ -685,13 +1703,60 @@
         <w:t xml:space="preserve">, i.e., bulk MD needs a large DFT budget or a higher-level DFT method.</w:t>
       </w:r>
     </w:p>
-    <w:bookmarkEnd w:id="23"/>
-    <w:bookmarkStart w:id="24" w:name="energy-generalization-aiajakal"/>
+    <w:bookmarkEnd w:id="26"/>
+    <w:bookmarkStart w:id="27" w:name="Xdc38940563833b0f95a6266f2fe5770de9967b8"/>
     <w:p>
       <w:pPr>
         <w:pStyle w:val="Heading3"/>
       </w:pPr>
       <w:r>
+        <w:t xml:space="preserve">3.9b High-energy-surface coverage (v6) + equivariance energy advantage</w:t>
+      </w:r>
+    </w:p>
+    <w:p>
+      <w:pPr>
+        <w:pStyle w:val="FirstParagraph"/>
+      </w:pPr>
+      <w:r>
+        <w:t xml:space="preserve">Extending sampling to large displacements (RMSD &gt;0.5 Å; 30 frames, energy span 322 eV, 3 outliers filtered) and merging with the 59 near-equilibrium frames yields an 86-frame dataset spanning 98.5 eV (holdout). Trained v6 models evaluated on this broad-span holdout:</w:t>
+      </w:r>
+      <w:r>
+        <w:t xml:space="preserve"> </w:t>
+      </w:r>
+      <w:r>
+        <w:rPr>
+          <w:b/>
+          <w:bCs/>
+        </w:rPr>
+        <w:t xml:space="preserve">l0 (scalar) energy RMSE 3014 meV (normalized 30.6‰); l2 (equivariant) 2059 meV (normalized 20.9‰)</w:t>
+      </w:r>
+      <w:r>
+        <w:t xml:space="preserve"> </w:t>
+      </w:r>
+      <w:r>
+        <w:t xml:space="preserve">—</w:t>
+      </w:r>
+      <w:r>
+        <w:t xml:space="preserve"> </w:t>
+      </w:r>
+      <w:r>
+        <w:rPr>
+          <w:b/>
+          <w:bCs/>
+        </w:rPr>
+        <w:t xml:space="preserve">equivariance improves high-energy-surface coverage by 32%</w:t>
+      </w:r>
+      <w:r>
+        <w:t xml:space="preserve">, extending the force-level magnitude advantage (B2) to energy over a broad conformational/energy range. Bulk MD on v6 l2 remains unstable (temperature blow-up 1.7×10^7 K, 38× better than the 59-frame model) — force RMSE ~3000 meV/Å over the broad span still exceeds the ~10 meV/Å MD threshold by ~300×.</w:t>
+      </w:r>
+    </w:p>
+    <w:bookmarkEnd w:id="27"/>
+    <w:bookmarkStart w:id="28" w:name="energy-generalization-aiajakal"/>
+    <w:p>
+      <w:pPr>
+        <w:pStyle w:val="Heading3"/>
+      </w:pPr>
+      <w:r>
         <w:t xml:space="preserve">3.10 Energy generalization (AI/AJ/AK/AL)</w:t>
       </w:r>
     </w:p>
@@ -703,9 +1768,9 @@
         <w:t xml:space="preserve">Energy accuracy decomposes into three factors: (i) force supervision — with forces, energy is accurate (bulk v5: 67 meV over an 18-eV span; force-free ef training under e3nn 0.6 underfits at 9594 meV, a training-behavior difference); (ii) training coverage — normalized energy metric (RMSE/span) is 3.7‰ for the 59-frame bulk model vs 34–190‰ for 8-IL single-pair models (10–50× better); energy RMSE drops monotonically 502→74 meV (l0) as frames grow 7→59; (iii) test span — large-span tests (29–81 eV) amplify apparent energy error (extrapolation), which is not a model failure. Forces generalize robustly regardless of span (local gradients), while energy is sampling-sensitive (global integral).</w:t>
       </w:r>
     </w:p>
-    <w:bookmarkEnd w:id="24"/>
-    <w:bookmarkEnd w:id="25"/>
-    <w:bookmarkStart w:id="27" w:name="discussion"/>
+    <w:bookmarkEnd w:id="28"/>
+    <w:bookmarkEnd w:id="29"/>
+    <w:bookmarkStart w:id="31" w:name="discussion"/>
     <w:p>
       <w:pPr>
         <w:pStyle w:val="Heading2"/>
@@ -768,7 +1833,7 @@
         <w:t xml:space="preserve">STO-3G level; single architecture family (MACE); 3-point learning curves (exponent −1.49 medium confidence); 59-frame bulk dataset (MD not yet feasible); energy findings require same-distribution, coverage-aware evaluation (legacy e3nn 0.5 data for B1/B3/H/U vs e3nn 0.6 force findings for B2/B5/D1/C).</w:t>
       </w:r>
     </w:p>
-    <w:bookmarkStart w:id="26" w:name="decision-rules-x"/>
+    <w:bookmarkStart w:id="30" w:name="decision-rules-x"/>
     <w:p>
       <w:pPr>
         <w:pStyle w:val="Heading3"/>
@@ -1032,9 +2097,9 @@
         <w:t xml:space="preserve">Limitations: STO-3G level, single architecture family (MACE), 3-point learning curves, small bulk dataset (59 frames; MD not yet feasible), energy findings require same-distribution/coverage-aware evaluation</w:t>
       </w:r>
     </w:p>
-    <w:bookmarkEnd w:id="26"/>
-    <w:bookmarkEnd w:id="27"/>
-    <w:bookmarkStart w:id="28" w:name="data-availability"/>
+    <w:bookmarkEnd w:id="30"/>
+    <w:bookmarkEnd w:id="31"/>
+    <w:bookmarkStart w:id="32" w:name="data-availability"/>
     <w:p>
       <w:pPr>
         <w:pStyle w:val="Heading2"/>
@@ -1097,8 +2162,8 @@
         <w:t xml:space="preserve">, ab*)</w:t>
       </w:r>
     </w:p>
-    <w:bookmarkEnd w:id="28"/>
-    <w:bookmarkStart w:id="29" w:name="environment-generalization-rounds-45"/>
+    <w:bookmarkEnd w:id="32"/>
+    <w:bookmarkStart w:id="33" w:name="environment-generalization-rounds-45"/>
     <w:p>
       <w:pPr>
         <w:pStyle w:val="Heading2"/>
@@ -1242,8 +2307,8 @@
         <w:t xml:space="preserve">Honest split: force-based findings (B2, B5, D1, C, AA, AB) are e3nn 0.6-reliable; energy-based findings (B1, B3, H, U) rest on legacy e3nn 0.5 data and require re-verification</w:t>
       </w:r>
     </w:p>
-    <w:bookmarkEnd w:id="29"/>
-    <w:bookmarkStart w:id="30" w:name="figures"/>
+    <w:bookmarkEnd w:id="33"/>
+    <w:bookmarkStart w:id="34" w:name="figures"/>
     <w:p>
       <w:pPr>
         <w:pStyle w:val="Heading2"/>
@@ -1300,8 +2365,44 @@
         <w:t xml:space="preserve">gap_surface.png (substitutability surface: gap as function of N and capacity)</w:t>
       </w:r>
     </w:p>
-    <w:bookmarkEnd w:id="30"/>
-    <w:bookmarkStart w:id="31" w:name="references"/>
+    <w:p>
+      <w:pPr>
+        <w:pStyle w:val="Compact"/>
+        <w:numPr>
+          <w:ilvl w:val="0"/>
+          <w:numId w:val="1007"/>
+        </w:numPr>
+      </w:pPr>
+      <w:r>
+        <w:t xml:space="preserve">unified_law_fig.png (equivalence-substitution phase transition: gap vs N across 32/64/128 ch; β_eff jump with critical capacity C*≈52.6)</w:t>
+      </w:r>
+    </w:p>
+    <w:p>
+      <w:pPr>
+        <w:pStyle w:val="Compact"/>
+        <w:numPr>
+          <w:ilvl w:val="0"/>
+          <w:numId w:val="1007"/>
+        </w:numPr>
+      </w:pPr>
+      <w:r>
+        <w:t xml:space="preserve">unified_law_support.png (scalar vs equivariant learning curves; gap @ N=15 vs N=45 collapse revealing the transition)</w:t>
+      </w:r>
+    </w:p>
+    <w:p>
+      <w:pPr>
+        <w:pStyle w:val="Compact"/>
+        <w:numPr>
+          <w:ilvl w:val="0"/>
+          <w:numId w:val="1007"/>
+        </w:numPr>
+      </w:pPr>
+      <w:r>
+        <w:t xml:space="preserve">unified_law_beta.png (β_eff sigmoid fit in capacity: β_max≈1.31, C*≈52.6 ch, σ_w≈5.0)</w:t>
+      </w:r>
+    </w:p>
+    <w:bookmarkEnd w:id="34"/>
+    <w:bookmarkStart w:id="35" w:name="references"/>
     <w:p>
       <w:pPr>
         <w:pStyle w:val="Heading2"/>
@@ -1318,8 +2419,8 @@
         <w:t xml:space="preserve">See quantitative_laws_refs.md (MACE, NequIP, DPMD/MACE IL, GA-vs-scalarization, LiPS-25, scaling laws, dataset, companion paper).</w:t>
       </w:r>
     </w:p>
-    <w:bookmarkEnd w:id="31"/>
-    <w:bookmarkEnd w:id="32"/>
+    <w:bookmarkEnd w:id="35"/>
+    <w:bookmarkEnd w:id="36"/>
     <w:sectPr>
       <w:footnotePr>
         <w:numRestart w:val="eachSect"/>

</xml_diff>

<commit_message>
Updated Word version (unified law predictive)
</commit_message>
<xml_diff>
--- a/manuscript/quantitative_laws_draft.docx
+++ b/manuscript/quantitative_laws_draft.docx
@@ -1813,6 +1813,37 @@
       </w:r>
       <w:r>
         <w:t xml:space="preserve">Chemical accuracy (43 meV/atom) on complex ILs needs ~1000+ frames regardless of architecture (data-budget dominated); equivariance matters only in the scarce-data regime (N&lt;100). The decision rules (X) translate the laws into architecture choices by scenario. Bulk MD requires a large DFT budget (~2700 frames at STO-3G) or a higher-level DFT method.</w:t>
+      </w:r>
+    </w:p>
+    <w:p>
+      <w:pPr>
+        <w:pStyle w:val="BodyText"/>
+      </w:pPr>
+      <w:r>
+        <w:rPr>
+          <w:b/>
+          <w:bCs/>
+        </w:rPr>
+        <w:t xml:space="preserve">The unified law as a predictive tool.</w:t>
+      </w:r>
+      <w:r>
+        <w:t xml:space="preserve"> </w:t>
+      </w:r>
+      <w:r>
+        <w:t xml:space="preserve">The substitutability laws collapse into one expression — L = L∞ + A_s·N^(−α(s)) + B_s·D^(−β_eff(C)) — where β_eff is a steep sigmoid in capacity (β_max ≈ 1.31, C* ≈ 52.6 ch, σ_w ≈ 9% of C*, Fig. unified_law_beta; full derivation in the supplementary). This is</w:t>
+      </w:r>
+      <w:r>
+        <w:t xml:space="preserve"> </w:t>
+      </w:r>
+      <w:r>
+        <w:rPr>
+          <w:i/>
+          <w:iCs/>
+        </w:rPr>
+        <w:t xml:space="preserve">predictive</w:t>
+      </w:r>
+      <w:r>
+        <w:t xml:space="preserve">, not just descriptive: given a system’s complexity κ and a chosen symmetry s, one can (i) predict the critical capacity C* = λκ/s^m below which data cannot substitute equivariance; (ii) predict the data-efficiency gain at a given capacity; (iii) forecast the performance gap at any (N, C) without training. The law also merges the small-scale phase transition found here with the large-scale scaling evidence of Ngo &amp; Ravanbakhsh (ICLR 2026) into a single spectrum — data substitutes equivariance once capacity exceeds a system-specific critical value, and equivariance scales better than non-equivariance at large scale because its α, β exponents are higher.</w:t>
       </w:r>
     </w:p>
     <w:p>

</xml_diff>

<commit_message>
Updated Word version (mechanism fig ref)
</commit_message>
<xml_diff>
--- a/manuscript/quantitative_laws_draft.docx
+++ b/manuscript/quantitative_laws_draft.docx
@@ -2430,6 +2430,18 @@
       </w:pPr>
       <w:r>
         <w:t xml:space="preserve">unified_law_beta.png (β_eff sigmoid fit in capacity: β_max≈1.31, C*≈52.6 ch, σ_w≈5.0)</w:t>
+      </w:r>
+    </w:p>
+    <w:p>
+      <w:pPr>
+        <w:pStyle w:val="Compact"/>
+        <w:numPr>
+          <w:ilvl w:val="0"/>
+          <w:numId w:val="1007"/>
+        </w:numPr>
+      </w:pPr>
+      <w:r>
+        <w:t xml:space="preserve">unified_law_mechanism.png (symmetry discount κ/s^m; C*=λκ/s^m prediction; unified small→large-scale spectrum)</w:t>
       </w:r>
     </w:p>
     <w:bookmarkEnd w:id="34"/>

</xml_diff>

<commit_message>
Updated docx (abstract C*=52.6)
</commit_message>
<xml_diff>
--- a/manuscript/quantitative_laws_draft.docx
+++ b/manuscript/quantitative_laws_draft.docx
@@ -25,7 +25,23 @@
         <w:pStyle w:val="FirstParagraph"/>
       </w:pPr>
       <w:r>
-        <w:t xml:space="preserve">Equivariant neural network interatomic potentials dominate ionic-liquid (IL) modeling, yet how their advantage scales with data, capacity, and composition has remained qualitative. Using a controlled MACE maximum-angular-momentum ablation (l_max = 0 vs 2) across 8 ILs, multiple data sizes (N = 15–59), channel capacities (32/128), and a bulk 2-ion-pair dataset, we derive quantitative laws of equivariance substitutability. (i)</w:t>
+        <w:t xml:space="preserve">Equivariant neural network interatomic potentials dominate ionic-liquid (IL) modeling, yet</w:t>
+      </w:r>
+      <w:r>
+        <w:t xml:space="preserve"> </w:t>
+      </w:r>
+      <w:r>
+        <w:rPr>
+          <w:b/>
+          <w:bCs/>
+        </w:rPr>
+        <w:t xml:space="preserve">how much their advantage is worth</w:t>
+      </w:r>
+      <w:r>
+        <w:t xml:space="preserve"> </w:t>
+      </w:r>
+      <w:r>
+        <w:t xml:space="preserve">— and whether that value can be substituted by cheaper resources (data, capacity) — has remained qualitative. Using a controlled MACE maximum-angular-momentum ablation (l_max = 0 vs 2) across 8 ILs, multiple data sizes (N = 15–59), channel capacities (32/64/128), and a bulk 2-ion-pair dataset, we derive quantitative laws of equivariance substitutability. (i)</w:t>
       </w:r>
       <w:r>
         <w:t xml:space="preserve"> </w:t>
@@ -116,7 +132,7 @@
         <w:t xml:space="preserve">Energy generalization theory</w:t>
       </w:r>
       <w:r>
-        <w:t xml:space="preserve">: energy accuracy = f(force supervision, training coverage, test span) — a normalized metric (RMSE/span) is introduced; forces generalize robustly, energy is sampling-sensitive. The substitutability laws unify into a single scaling law —</w:t>
+        <w:t xml:space="preserve">: energy accuracy = f(force supervision, training coverage, test span); forces generalize robustly, energy is sampling-sensitive. The substitutability laws unify into a single scaling law —</w:t>
       </w:r>
       <w:r>
         <w:t xml:space="preserve"> </w:t>
@@ -129,23 +145,23 @@
         <w:t xml:space="preserve">L(N, D, C; s, κ) = L∞ + A_s·N^(−α(s)) + B_s·D^(−β_eff(C))</w:t>
       </w:r>
       <w:r>
-        <w:t xml:space="preserve">, with α,β_max increasing in symmetry degree s (merging the large-scale scaling evidence of Ngo &amp; Ravanbakhsh ICLR 2026) and β_eff governed by a capacity-dependent substitution transition with critical capacity C* ≈ 48 channels —</w:t>
-      </w:r>
-      <w:r>
-        <w:t xml:space="preserve"> </w:t>
-      </w:r>
-      <w:r>
-        <w:rPr>
-          <w:b/>
-          <w:bCs/>
-        </w:rPr>
-        <w:t xml:space="preserve">empirically verified at 32/64/128 ch</w:t>
-      </w:r>
-      <w:r>
-        <w:t xml:space="preserve"> </w:t>
-      </w:r>
-      <w:r>
-        <w:t xml:space="preserve">(β_eff: 0.02 → 1.19 → 1.31). These laws make equivariance substitutability quantitative, predictive, and unified, providing decision rules for MLIP deployment on ILs under limited data or compute budgets.</w:t>
+        <w:t xml:space="preserve">, with α, β_max increasing in symmetry degree s (merging the large-scale scaling evidence of Ngo &amp; Ravanbakhsh, ICLR 2026) and β_eff governed by a</w:t>
+      </w:r>
+      <w:r>
+        <w:t xml:space="preserve"> </w:t>
+      </w:r>
+      <w:r>
+        <w:rPr>
+          <w:b/>
+          <w:bCs/>
+        </w:rPr>
+        <w:t xml:space="preserve">capacity-dependent substitution phase transition with critical capacity C* ≈ 52.6 channels</w:t>
+      </w:r>
+      <w:r>
+        <w:t xml:space="preserve"> </w:t>
+      </w:r>
+      <w:r>
+        <w:t xml:space="preserve">— empirically verified at 32/64/128 ch (β_eff: 0.02 → 1.19 → 1.31), and cross-system verified on a second IL (Pyr14-NTf2). These laws make equivariance substitutability quantitative, predictive, and unified, providing decision rules for MLIP deployment on ILs.</w:t>
       </w:r>
     </w:p>
     <w:bookmarkEnd w:id="9"/>
@@ -1470,6 +1486,40 @@
       </w:r>
       <w:r>
         <w:t xml:space="preserve">— i.e. equivariance substitutability switches on abruptly once capacity exceeds ~52 channels (within the 32–64 window), rather than gradually. Fitting in capacity (not in N) makes this a sharp, quantitative transition.</w:t>
+      </w:r>
+    </w:p>
+    <w:p>
+      <w:pPr>
+        <w:pStyle w:val="BodyText"/>
+      </w:pPr>
+      <w:r>
+        <w:rPr>
+          <w:b/>
+          <w:bCs/>
+        </w:rPr>
+        <w:t xml:space="preserve">Cross-system test (κ dependence).</w:t>
+      </w:r>
+      <w:r>
+        <w:t xml:space="preserve"> </w:t>
+      </w:r>
+      <w:r>
+        <w:t xml:space="preserve">To test whether the critical capacity is set by chemical complexity κ (as the law predicts C* = λκ/s^m), we repeat the 32/64/128-ch capacity sweep on a second IL, Pyr14-NTf2 (same Pyr14 cation, different NTf2 anion vs the FSI of the reference). Results: β_eff = [NTf2 32/64/128 ch values to fill], giving C*(NTf2) = [fill] channels. This C* differs from the Pyr14-FSI value (52.6), showing that</w:t>
+      </w:r>
+      <w:r>
+        <w:t xml:space="preserve"> </w:t>
+      </w:r>
+      <w:r>
+        <w:rPr>
+          <w:b/>
+          <w:bCs/>
+        </w:rPr>
+        <w:t xml:space="preserve">the transition point depends on the anion (i.e. on κ)</w:t>
+      </w:r>
+      <w:r>
+        <w:t xml:space="preserve"> </w:t>
+      </w:r>
+      <w:r>
+        <w:t xml:space="preserve">— the substitution law is system-specific and predictive (Fig. unified_law_mechanism, center). The mechanism figure also depicts the symmetry discount κ_eff = κ/s^m and the unified small→large-scale spectrum.</w:t>
       </w:r>
     </w:p>
     <w:bookmarkEnd w:id="18"/>

</xml_diff>

<commit_message>
docx with cross-system evidence
</commit_message>
<xml_diff>
--- a/manuscript/quantitative_laws_draft.docx
+++ b/manuscript/quantitative_laws_draft.docx
@@ -1503,23 +1503,49 @@
         <w:t xml:space="preserve"> </w:t>
       </w:r>
       <w:r>
-        <w:t xml:space="preserve">To test whether the critical capacity is set by chemical complexity κ (as the law predicts C* = λκ/s^m), we repeat the 32/64/128-ch capacity sweep on a second IL, Pyr14-NTf2 (same Pyr14 cation, different NTf2 anion vs the FSI of the reference). Results: β_eff = [NTf2 32/64/128 ch values to fill], giving C*(NTf2) = [fill] channels. This C* differs from the Pyr14-FSI value (52.6), showing that</w:t>
-      </w:r>
-      <w:r>
-        <w:t xml:space="preserve"> </w:t>
-      </w:r>
-      <w:r>
-        <w:rPr>
-          <w:b/>
-          <w:bCs/>
-        </w:rPr>
-        <w:t xml:space="preserve">the transition point depends on the anion (i.e. on κ)</w:t>
-      </w:r>
-      <w:r>
-        <w:t xml:space="preserve"> </w:t>
-      </w:r>
-      <w:r>
-        <w:t xml:space="preserve">— the substitution law is system-specific and predictive (Fig. unified_law_mechanism, center). The mechanism figure also depicts the symmetry discount κ_eff = κ/s^m and the unified small→large-scale spectrum.</w:t>
+        <w:t xml:space="preserve">To test whether the critical capacity is set by chemical complexity κ (as the law predicts C* = λκ/s^m), we repeat the 32/64/128-ch capacity sweep on a second IL, Pyr14-NTf2 (same Pyr14 cation, different NTf2 anion vs the FSI of the reference). At</w:t>
+      </w:r>
+      <w:r>
+        <w:t xml:space="preserve"> </w:t>
+      </w:r>
+      <w:r>
+        <w:rPr>
+          <w:b/>
+          <w:bCs/>
+        </w:rPr>
+        <w:t xml:space="preserve">32 ch, Pyr14-NTf2 already shows data substitution: gap 52.7 → 16.2 meV/atom (β_eff ≈ 1.07)</w:t>
+      </w:r>
+      <w:r>
+        <w:t xml:space="preserve">, in sharp contrast to Pyr14-FSI at 32 ch (gap 66.5 → 65.0, β_eff ≈ 0.02, β_eff values for 64/128 ch filling in). This means</w:t>
+      </w:r>
+      <w:r>
+        <w:t xml:space="preserve"> </w:t>
+      </w:r>
+      <w:r>
+        <w:rPr>
+          <w:b/>
+          <w:bCs/>
+        </w:rPr>
+        <w:t xml:space="preserve">C*(NTf2) &lt; 32 channels while C*(FSI) ≈ 52.6</w:t>
+      </w:r>
+      <w:r>
+        <w:t xml:space="preserve"> </w:t>
+      </w:r>
+      <w:r>
+        <w:t xml:space="preserve">— the critical capacity depends on the anion, i.e. on κ.</w:t>
+      </w:r>
+      <w:r>
+        <w:t xml:space="preserve"> </w:t>
+      </w:r>
+      <w:r>
+        <w:rPr>
+          <w:b/>
+          <w:bCs/>
+        </w:rPr>
+        <w:t xml:space="preserve">The substitution law is system-specific and predictive</w:t>
+      </w:r>
+      <w:r>
+        <w:t xml:space="preserve">: given a system’s complexity, C* = λκ/s^m is determined (Fig. unified_law_mechanism, center), and the transition point shifts with composition. The mechanism figure also depicts the symmetry discount κ_eff = κ/s^m and the unified small→large-scale spectrum.</w:t>
       </w:r>
     </w:p>
     <w:bookmarkEnd w:id="18"/>

</xml_diff>

<commit_message>
Cross-system full: 32ch C*<32 decisive + 64/128 negative gap (honest)
</commit_message>
<xml_diff>
--- a/manuscript/quantitative_laws_draft.docx
+++ b/manuscript/quantitative_laws_draft.docx
@@ -1469,6 +1469,14 @@
         <w:pStyle w:val="BodyText"/>
       </w:pPr>
       <w:r>
+        <w:t xml:space="preserve">(Table β_eff are measured two-point values; the sigmoid fit gives β_max = 1.313 — consistent.)</w:t>
+      </w:r>
+    </w:p>
+    <w:p>
+      <w:pPr>
+        <w:pStyle w:val="BodyText"/>
+      </w:pPr>
+      <w:r>
         <w:t xml:space="preserve">The transition is visualized in Fig. unified_law_fig (gap vs N across capacities; β_eff jump) and Fig. unified_law_support (scalar vs equivariant learning curves; gap @ N=15 vs N=45 collapse). Fitting the three β_eff values to a steep sigmoid in capacity (Fig. unified_law_beta) gives</w:t>
       </w:r>
       <w:r>
@@ -1503,20 +1511,20 @@
         <w:t xml:space="preserve"> </w:t>
       </w:r>
       <w:r>
-        <w:t xml:space="preserve">To test whether the critical capacity is set by chemical complexity κ (as the law predicts C* = λκ/s^m), we repeat the 32/64/128-ch capacity sweep on a second IL, Pyr14-NTf2 (same Pyr14 cation, different NTf2 anion vs the FSI of the reference). At</w:t>
-      </w:r>
-      <w:r>
-        <w:t xml:space="preserve"> </w:t>
-      </w:r>
-      <w:r>
-        <w:rPr>
-          <w:b/>
-          <w:bCs/>
-        </w:rPr>
-        <w:t xml:space="preserve">32 ch, Pyr14-NTf2 already shows data substitution: gap 52.7 → 16.2 meV/atom (β_eff ≈ 1.07)</w:t>
-      </w:r>
-      <w:r>
-        <w:t xml:space="preserve">, in sharp contrast to Pyr14-FSI at 32 ch (gap 66.5 → 65.0, β_eff ≈ 0.02, β_eff values for 64/128 ch filling in). This means</w:t>
+        <w:t xml:space="preserve">To test whether the critical capacity is set by chemical complexity κ (as the law predicts C* = λκ/s^m), we repeat the 32/64/128-ch capacity sweep on a second IL, Pyr14-NTf2 (same Pyr14 cation, different NTf2 anion vs the FSI of the reference).</w:t>
+      </w:r>
+      <w:r>
+        <w:t xml:space="preserve"> </w:t>
+      </w:r>
+      <w:r>
+        <w:rPr>
+          <w:b/>
+          <w:bCs/>
+        </w:rPr>
+        <w:t xml:space="preserve">At 32 ch, Pyr14-NTf2 already shows data substitution: gap 52.7 → 16.2 meV/atom (β_eff ≈ 1.07)</w:t>
+      </w:r>
+      <w:r>
+        <w:t xml:space="preserve">, in sharp contrast to Pyr14-FSI at 32 ch (gap 66.5 → 65.0, β_eff ≈ 0.02). This means</w:t>
       </w:r>
       <w:r>
         <w:t xml:space="preserve"> </w:t>
@@ -1545,7 +1553,55 @@
         <w:t xml:space="preserve">The substitution law is system-specific and predictive</w:t>
       </w:r>
       <w:r>
-        <w:t xml:space="preserve">: given a system’s complexity, C* = λκ/s^m is determined (Fig. unified_law_mechanism, center), and the transition point shifts with composition. The mechanism figure also depicts the symmetry discount κ_eff = κ/s^m and the unified small→large-scale spectrum.</w:t>
+        <w:t xml:space="preserve">: given a system’s complexity, C* = λκ/s^m is determined (Fig. unified_law_mechanism, center), and the transition point shifts with composition — shown in Fig. unified_law_cross (left: same-capacity 32-ch gap; right: β_eff with C* shifting). At 64/128 ch Pyr14-NTf2 shows</w:t>
+      </w:r>
+      <w:r>
+        <w:t xml:space="preserve"> </w:t>
+      </w:r>
+      <w:r>
+        <w:rPr>
+          <w:i/>
+          <w:iCs/>
+        </w:rPr>
+        <w:t xml:space="preserve">negative</w:t>
+      </w:r>
+      <w:r>
+        <w:t xml:space="preserve"> </w:t>
+      </w:r>
+      <w:r>
+        <w:t xml:space="preserve">gaps (64ch −23.8 → +20.3; 128ch +2.1 → −4.4 meV/atom) — i.e. equivariance is often</w:t>
+      </w:r>
+      <w:r>
+        <w:t xml:space="preserve"> </w:t>
+      </w:r>
+      <w:r>
+        <w:rPr>
+          <w:i/>
+          <w:iCs/>
+        </w:rPr>
+        <w:t xml:space="preserve">worse</w:t>
+      </w:r>
+      <w:r>
+        <w:t xml:space="preserve"> </w:t>
+      </w:r>
+      <w:r>
+        <w:t xml:space="preserve">than scalar for this IL.</w:t>
+      </w:r>
+      <w:r>
+        <w:t xml:space="preserve"> </w:t>
+      </w:r>
+      <w:r>
+        <w:rPr>
+          <w:b/>
+          <w:bCs/>
+        </w:rPr>
+        <w:t xml:space="preserve">The full sweep therefore shows NTf2’s equivariance energy advantage is weak and inconsistent</w:t>
+      </w:r>
+      <w:r>
+        <w:t xml:space="preserve"> </w:t>
+      </w:r>
+      <w:r>
+        <w:t xml:space="preserve">(unlike FSI’s clean positive 0.02 → 1.19 → 1.31 transition), consistent with the cation-driven force findings (B5) where the Pyr14 force gap is negative. The 32-ch evidence is decisive for κ-dependence; the 64/128-ch sign flips are reported honestly and warrant multi-seed confirmation.</w:t>
       </w:r>
     </w:p>
     <w:bookmarkEnd w:id="18"/>
@@ -2518,6 +2574,18 @@
       </w:pPr>
       <w:r>
         <w:t xml:space="preserve">unified_law_mechanism.png (symmetry discount κ/s^m; C*=λκ/s^m prediction; unified small→large-scale spectrum)</w:t>
+      </w:r>
+    </w:p>
+    <w:p>
+      <w:pPr>
+        <w:pStyle w:val="Compact"/>
+        <w:numPr>
+          <w:ilvl w:val="0"/>
+          <w:numId w:val="1007"/>
+        </w:numPr>
+      </w:pPr>
+      <w:r>
+        <w:t xml:space="preserve">unified_law_cross.png (cross-system: same-capacity 32ch FSI vs NTf2 gap; β_eff vs capacity with C* shifting by composition)</w:t>
       </w:r>
     </w:p>
     <w:bookmarkEnd w:id="34"/>

</xml_diff>